<commit_message>
feat: implement Open Tournament (Lintas Daerah) mode with dual-conflict seeding
</commit_message>
<xml_diff>
--- a/panduan_wasit.docx
+++ b/panduan_wasit.docx
@@ -9,7 +9,7 @@
         <w:bidi w:val="false"/>
         <w:spacing w:after="120" w:before="480"/>
       </w:pPr>
-      <w:bookmarkStart w:name="_Toc__PANDUAN_OPERASIONAL_WASIT_1779105570536" w:id="1"/>
+      <w:bookmarkStart w:name="_Toc__PANDUAN_OPERASIONAL_WASIT_1779166323401" w:id="1"/>
       <w:r>
         <w:rPr>
           <w:b w:val="false"/>
@@ -33,7 +33,7 @@
         <w:bidi w:val="false"/>
         <w:spacing w:after="120" w:before="240"/>
       </w:pPr>
-      <w:bookmarkStart w:name="_Toc_Aplikasi_Turnamen_Layangan_Kabupaten_Maj_1779105570537" w:id="1"/>
+      <w:bookmarkStart w:name="_Toc_Aplikasi_Turnamen_Layangan_Kabupaten_Maj_1779166323402" w:id="1"/>
       <w:r>
         <w:rPr>
           <w:b w:val="false"/>
@@ -73,7 +73,7 @@
         <w:bidi w:val="false"/>
         <w:spacing w:after="120" w:before="240"/>
       </w:pPr>
-      <w:bookmarkStart w:name="_Toc__1_Hak_Akses_Login_Wasit_1779105570537" w:id="1"/>
+      <w:bookmarkStart w:name="_Toc__1_Hak_Akses_Login_Wasit_1779166323402" w:id="1"/>
       <w:r>
         <w:rPr>
           <w:b w:val="false"/>
@@ -215,7 +215,7 @@
         <w:bidi w:val="false"/>
         <w:spacing w:after="120" w:before="240"/>
       </w:pPr>
-      <w:bookmarkStart w:name="_Toc__2_Membuat_Bagan_Otomatis_Setup_Wizard_1779105570538" w:id="1"/>
+      <w:bookmarkStart w:name="_Toc__2_Membuat_Bagan_Otomatis_Setup_Wizard_1779166323404" w:id="1"/>
       <w:r>
         <w:rPr>
           <w:b w:val="false"/>
@@ -451,7 +451,7 @@
                 <w:szCs w:val="24"/>
                 <w:rtl w:val="false"/>
               </w:rPr>
-              <w:t xml:space="preserve">Kapasitas Per Bagan</w:t>
+              <w:t xml:space="preserve">Tipe Cakupan Turnamen</w:t>
             </w:r>
           </w:p>
         </w:tc>
@@ -467,7 +467,36 @@
                 <w:szCs w:val="24"/>
                 <w:rtl w:val="false"/>
               </w:rPr>
-              <w:t xml:space="preserve">Pilih ukuran bagan per pool (</w:t>
+              <w:t xml:space="preserve">&lt;ul&gt;</w:t>
+            </w:r>
+            <w:r>
+              <w:rPr>
+                <w:color w:val="000000"/>
+                <w:sz w:val="24"/>
+                <w:szCs w:val="24"/>
+                <w:rtl w:val="false"/>
+              </w:rPr>
+              <w:t xml:space="preserve">&lt;li&gt;</w:t>
+            </w:r>
+            <w:r>
+              <w:rPr>
+                <w:b/>
+                <w:bCs/>
+                <w:color w:val="000000"/>
+                <w:sz w:val="24"/>
+                <w:szCs w:val="24"/>
+                <w:rtl w:val="false"/>
+              </w:rPr>
+              <w:t xml:space="preserve">Lokal / Club Match:</w:t>
+            </w:r>
+            <w:r>
+              <w:rPr>
+                <w:color w:val="000000"/>
+                <w:sz w:val="24"/>
+                <w:szCs w:val="24"/>
+                <w:rtl w:val="false"/>
+              </w:rPr>
+              <w:t xml:space="preserve"> (Default) Memisahkan peserta dari tim yang sama. Format input nama: </w:t>
             </w:r>
             <w:r>
               <w:rPr>
@@ -478,16 +507,54 @@
                 <w:shd w:fill="F5F5F5"/>
                 <w:rtl w:val="false"/>
               </w:rPr>
-              <w:t xml:space="preserve">16</w:t>
-            </w:r>
-            <w:r>
-              <w:rPr>
-                <w:color w:val="000000"/>
-                <w:sz w:val="24"/>
-                <w:szCs w:val="24"/>
-                <w:rtl w:val="false"/>
-              </w:rPr>
-              <w:t xml:space="preserve">, </w:t>
+              <w:t xml:space="preserve">[Nama Tim] Nama Peserta</w:t>
+            </w:r>
+            <w:r>
+              <w:rPr>
+                <w:color w:val="000000"/>
+                <w:sz w:val="24"/>
+                <w:szCs w:val="24"/>
+                <w:rtl w:val="false"/>
+              </w:rPr>
+              <w:t xml:space="preserve">.</w:t>
+            </w:r>
+            <w:r>
+              <w:rPr>
+                <w:color w:val="000000"/>
+                <w:sz w:val="24"/>
+                <w:szCs w:val="24"/>
+                <w:rtl w:val="false"/>
+              </w:rPr>
+              <w:t xml:space="preserve">&lt;/li&gt;</w:t>
+            </w:r>
+            <w:r>
+              <w:rPr>
+                <w:color w:val="000000"/>
+                <w:sz w:val="24"/>
+                <w:szCs w:val="24"/>
+                <w:rtl w:val="false"/>
+              </w:rPr>
+              <w:t xml:space="preserve">&lt;li&gt;</w:t>
+            </w:r>
+            <w:r>
+              <w:rPr>
+                <w:b/>
+                <w:bCs/>
+                <w:color w:val="000000"/>
+                <w:sz w:val="24"/>
+                <w:szCs w:val="24"/>
+                <w:rtl w:val="false"/>
+              </w:rPr>
+              <w:t xml:space="preserve">Open Cup (Lintas Daerah):</w:t>
+            </w:r>
+            <w:r>
+              <w:rPr>
+                <w:color w:val="000000"/>
+                <w:sz w:val="24"/>
+                <w:szCs w:val="24"/>
+                <w:rtl w:val="false"/>
+              </w:rPr>
+              <w:t xml:space="preserve"> Memisahkan peserta dari daerah yang sama DAN tim yang sama secara bersamaan. Format input nama: </w:t>
             </w:r>
             <w:r>
               <w:rPr>
@@ -498,16 +565,16 @@
                 <w:shd w:fill="F5F5F5"/>
                 <w:rtl w:val="false"/>
               </w:rPr>
-              <w:t xml:space="preserve">32</w:t>
-            </w:r>
-            <w:r>
-              <w:rPr>
-                <w:color w:val="000000"/>
-                <w:sz w:val="24"/>
-                <w:szCs w:val="24"/>
-                <w:rtl w:val="false"/>
-              </w:rPr>
-              <w:t xml:space="preserve">, </w:t>
+              <w:t xml:space="preserve">[Nama Daerah-Nama Tim] Nama Peserta</w:t>
+            </w:r>
+            <w:r>
+              <w:rPr>
+                <w:color w:val="000000"/>
+                <w:sz w:val="24"/>
+                <w:szCs w:val="24"/>
+                <w:rtl w:val="false"/>
+              </w:rPr>
+              <w:t xml:space="preserve"> (contoh: </w:t>
             </w:r>
             <w:r>
               <w:rPr>
@@ -518,56 +585,34 @@
                 <w:shd w:fill="F5F5F5"/>
                 <w:rtl w:val="false"/>
               </w:rPr>
-              <w:t xml:space="preserve">64</w:t>
-            </w:r>
-            <w:r>
-              <w:rPr>
-                <w:color w:val="000000"/>
-                <w:sz w:val="24"/>
-                <w:szCs w:val="24"/>
-                <w:rtl w:val="false"/>
-              </w:rPr>
-              <w:t xml:space="preserve">, atau </w:t>
-            </w:r>
-            <w:r>
-              <w:rPr>
-                <w:rFonts w:ascii="Courier New" w:cs="Courier New" w:eastAsia="Courier New" w:hAnsi="Courier New"/>
-                <w:color w:val="444444"/>
-                <w:sz w:val="20"/>
-                <w:szCs w:val="20"/>
-                <w:shd w:fill="F5F5F5"/>
-                <w:rtl w:val="false"/>
-              </w:rPr>
-              <w:t xml:space="preserve">AUTO</w:t>
-            </w:r>
-            <w:r>
-              <w:rPr>
-                <w:color w:val="000000"/>
-                <w:sz w:val="24"/>
-                <w:szCs w:val="24"/>
-                <w:rtl w:val="false"/>
-              </w:rPr>
-              <w:t xml:space="preserve">). Jika memilih </w:t>
-            </w:r>
-            <w:r>
-              <w:rPr>
-                <w:rFonts w:ascii="Courier New" w:cs="Courier New" w:eastAsia="Courier New" w:hAnsi="Courier New"/>
-                <w:color w:val="444444"/>
-                <w:sz w:val="20"/>
-                <w:szCs w:val="20"/>
-                <w:shd w:fill="F5F5F5"/>
-                <w:rtl w:val="false"/>
-              </w:rPr>
-              <w:t xml:space="preserve">AUTO</w:t>
-            </w:r>
-            <w:r>
-              <w:rPr>
-                <w:color w:val="000000"/>
-                <w:sz w:val="24"/>
-                <w:szCs w:val="24"/>
-                <w:rtl w:val="false"/>
-              </w:rPr>
-              <w:t xml:space="preserve">, sistem akan otomatis membagi jumlah peserta secara seimbang ke dalam pool-pool yang diperlukan.</w:t>
+              <w:t xml:space="preserve">[Majalengka-Senyap] Andi</w:t>
+            </w:r>
+            <w:r>
+              <w:rPr>
+                <w:color w:val="000000"/>
+                <w:sz w:val="24"/>
+                <w:szCs w:val="24"/>
+                <w:rtl w:val="false"/>
+              </w:rPr>
+              <w:t xml:space="preserve">).</w:t>
+            </w:r>
+            <w:r>
+              <w:rPr>
+                <w:color w:val="000000"/>
+                <w:sz w:val="24"/>
+                <w:szCs w:val="24"/>
+                <w:rtl w:val="false"/>
+              </w:rPr>
+              <w:t xml:space="preserve">&lt;/li&gt;</w:t>
+            </w:r>
+            <w:r>
+              <w:rPr>
+                <w:color w:val="000000"/>
+                <w:sz w:val="24"/>
+                <w:szCs w:val="24"/>
+                <w:rtl w:val="false"/>
+              </w:rPr>
+              <w:t xml:space="preserve">&lt;/ul&gt;</w:t>
             </w:r>
           </w:p>
         </w:tc>
@@ -587,7 +632,7 @@
                 <w:szCs w:val="24"/>
                 <w:rtl w:val="false"/>
               </w:rPr>
-              <w:t xml:space="preserve">Aturan Nyawa</w:t>
+              <w:t xml:space="preserve">Kapasitas Per Bagan</w:t>
             </w:r>
           </w:p>
         </w:tc>
@@ -603,112 +648,107 @@
                 <w:szCs w:val="24"/>
                 <w:rtl w:val="false"/>
               </w:rPr>
-              <w:t xml:space="preserve">&lt;ul&gt;</w:t>
-            </w:r>
-            <w:r>
-              <w:rPr>
-                <w:color w:val="000000"/>
-                <w:sz w:val="24"/>
-                <w:szCs w:val="24"/>
-                <w:rtl w:val="false"/>
-              </w:rPr>
-              <w:t xml:space="preserve">&lt;li&gt;</w:t>
-            </w:r>
-            <w:r>
-              <w:rPr>
-                <w:b/>
-                <w:bCs/>
-                <w:color w:val="000000"/>
-                <w:sz w:val="24"/>
-                <w:szCs w:val="24"/>
-                <w:rtl w:val="false"/>
-              </w:rPr>
-              <w:t xml:space="preserve">1 Nyawa:</w:t>
-            </w:r>
-            <w:r>
-              <w:rPr>
-                <w:color w:val="000000"/>
-                <w:sz w:val="24"/>
-                <w:szCs w:val="24"/>
-                <w:rtl w:val="false"/>
-              </w:rPr>
-              <w:t xml:space="preserve"> Format sistem gugur tunggal tradisional.</w:t>
-            </w:r>
-            <w:r>
-              <w:rPr>
-                <w:color w:val="000000"/>
-                <w:sz w:val="24"/>
-                <w:szCs w:val="24"/>
-                <w:rtl w:val="false"/>
-              </w:rPr>
-              <w:t xml:space="preserve">&lt;/li&gt;</w:t>
-            </w:r>
-            <w:r>
-              <w:rPr>
-                <w:color w:val="000000"/>
-                <w:sz w:val="24"/>
-                <w:szCs w:val="24"/>
-                <w:rtl w:val="false"/>
-              </w:rPr>
-              <w:t xml:space="preserve">&lt;li&gt;</w:t>
-            </w:r>
-            <w:r>
-              <w:rPr>
-                <w:b/>
-                <w:bCs/>
-                <w:color w:val="000000"/>
-                <w:sz w:val="24"/>
-                <w:szCs w:val="24"/>
-                <w:rtl w:val="false"/>
-              </w:rPr>
-              <w:t xml:space="preserve">2 Nyawa (Beda):</w:t>
-            </w:r>
-            <w:r>
-              <w:rPr>
-                <w:color w:val="000000"/>
-                <w:sz w:val="24"/>
-                <w:szCs w:val="24"/>
-                <w:rtl w:val="false"/>
-              </w:rPr>
-              <w:t xml:space="preserve"> Setiap peserta mendapatkan 2 kesempatan bertanding. Bagan akan dikalikan 2 (Bagan AB &amp; CD). Lawan di babak pertama Bagan CD diacak ulang secara otomatis untuk memastikan </w:t>
-            </w:r>
-            <w:r>
-              <w:rPr>
-                <w:b/>
-                <w:bCs/>
-                <w:color w:val="000000"/>
-                <w:sz w:val="24"/>
-                <w:szCs w:val="24"/>
-                <w:rtl w:val="false"/>
-              </w:rPr>
-              <w:t xml:space="preserve">tidak bertemu dengan lawan yang sama seperti di bagan AB</w:t>
-            </w:r>
-            <w:r>
-              <w:rPr>
-                <w:color w:val="000000"/>
-                <w:sz w:val="24"/>
-                <w:szCs w:val="24"/>
-                <w:rtl w:val="false"/>
-              </w:rPr>
-              <w:t xml:space="preserve">.</w:t>
-            </w:r>
-            <w:r>
-              <w:rPr>
-                <w:color w:val="000000"/>
-                <w:sz w:val="24"/>
-                <w:szCs w:val="24"/>
-                <w:rtl w:val="false"/>
-              </w:rPr>
-              <w:t xml:space="preserve">&lt;/li&gt;</w:t>
-            </w:r>
-            <w:r>
-              <w:rPr>
-                <w:color w:val="000000"/>
-                <w:sz w:val="24"/>
-                <w:szCs w:val="24"/>
-                <w:rtl w:val="false"/>
-              </w:rPr>
-              <w:t xml:space="preserve">&lt;/ul&gt;</w:t>
+              <w:t xml:space="preserve">Pilih ukuran bagan per pool (</w:t>
+            </w:r>
+            <w:r>
+              <w:rPr>
+                <w:rFonts w:ascii="Courier New" w:cs="Courier New" w:eastAsia="Courier New" w:hAnsi="Courier New"/>
+                <w:color w:val="444444"/>
+                <w:sz w:val="20"/>
+                <w:szCs w:val="20"/>
+                <w:shd w:fill="F5F5F5"/>
+                <w:rtl w:val="false"/>
+              </w:rPr>
+              <w:t xml:space="preserve">16</w:t>
+            </w:r>
+            <w:r>
+              <w:rPr>
+                <w:color w:val="000000"/>
+                <w:sz w:val="24"/>
+                <w:szCs w:val="24"/>
+                <w:rtl w:val="false"/>
+              </w:rPr>
+              <w:t xml:space="preserve">, </w:t>
+            </w:r>
+            <w:r>
+              <w:rPr>
+                <w:rFonts w:ascii="Courier New" w:cs="Courier New" w:eastAsia="Courier New" w:hAnsi="Courier New"/>
+                <w:color w:val="444444"/>
+                <w:sz w:val="20"/>
+                <w:szCs w:val="20"/>
+                <w:shd w:fill="F5F5F5"/>
+                <w:rtl w:val="false"/>
+              </w:rPr>
+              <w:t xml:space="preserve">32</w:t>
+            </w:r>
+            <w:r>
+              <w:rPr>
+                <w:color w:val="000000"/>
+                <w:sz w:val="24"/>
+                <w:szCs w:val="24"/>
+                <w:rtl w:val="false"/>
+              </w:rPr>
+              <w:t xml:space="preserve">, </w:t>
+            </w:r>
+            <w:r>
+              <w:rPr>
+                <w:rFonts w:ascii="Courier New" w:cs="Courier New" w:eastAsia="Courier New" w:hAnsi="Courier New"/>
+                <w:color w:val="444444"/>
+                <w:sz w:val="20"/>
+                <w:szCs w:val="20"/>
+                <w:shd w:fill="F5F5F5"/>
+                <w:rtl w:val="false"/>
+              </w:rPr>
+              <w:t xml:space="preserve">64</w:t>
+            </w:r>
+            <w:r>
+              <w:rPr>
+                <w:color w:val="000000"/>
+                <w:sz w:val="24"/>
+                <w:szCs w:val="24"/>
+                <w:rtl w:val="false"/>
+              </w:rPr>
+              <w:t xml:space="preserve">, atau </w:t>
+            </w:r>
+            <w:r>
+              <w:rPr>
+                <w:rFonts w:ascii="Courier New" w:cs="Courier New" w:eastAsia="Courier New" w:hAnsi="Courier New"/>
+                <w:color w:val="444444"/>
+                <w:sz w:val="20"/>
+                <w:szCs w:val="20"/>
+                <w:shd w:fill="F5F5F5"/>
+                <w:rtl w:val="false"/>
+              </w:rPr>
+              <w:t xml:space="preserve">AUTO</w:t>
+            </w:r>
+            <w:r>
+              <w:rPr>
+                <w:color w:val="000000"/>
+                <w:sz w:val="24"/>
+                <w:szCs w:val="24"/>
+                <w:rtl w:val="false"/>
+              </w:rPr>
+              <w:t xml:space="preserve">). Jika memilih </w:t>
+            </w:r>
+            <w:r>
+              <w:rPr>
+                <w:rFonts w:ascii="Courier New" w:cs="Courier New" w:eastAsia="Courier New" w:hAnsi="Courier New"/>
+                <w:color w:val="444444"/>
+                <w:sz w:val="20"/>
+                <w:szCs w:val="20"/>
+                <w:shd w:fill="F5F5F5"/>
+                <w:rtl w:val="false"/>
+              </w:rPr>
+              <w:t xml:space="preserve">AUTO</w:t>
+            </w:r>
+            <w:r>
+              <w:rPr>
+                <w:color w:val="000000"/>
+                <w:sz w:val="24"/>
+                <w:szCs w:val="24"/>
+                <w:rtl w:val="false"/>
+              </w:rPr>
+              <w:t xml:space="preserve">, sistem akan otomatis membagi jumlah peserta secara seimbang ke dalam pool-pool yang diperlukan.</w:t>
             </w:r>
           </w:p>
         </w:tc>
@@ -728,7 +768,7 @@
                 <w:szCs w:val="24"/>
                 <w:rtl w:val="false"/>
               </w:rPr>
-              <w:t xml:space="preserve">Format Bagan Final</w:t>
+              <w:t xml:space="preserve">Aturan Nyawa</w:t>
             </w:r>
           </w:p>
         </w:tc>
@@ -764,16 +804,16 @@
                 <w:szCs w:val="24"/>
                 <w:rtl w:val="false"/>
               </w:rPr>
-              <w:t xml:space="preserve">Liga (Round Robin):</w:t>
-            </w:r>
-            <w:r>
-              <w:rPr>
-                <w:color w:val="000000"/>
-                <w:sz w:val="24"/>
-                <w:szCs w:val="24"/>
-                <w:rtl w:val="false"/>
-              </w:rPr>
-              <w:t xml:space="preserve"> 3 juara dari masing-masing pool akan dipertemukan dalam format liga segitiga untuk saling bertanding menentukan Juara 1, 2, dan 3 berdasarkan poin tertinggi.</w:t>
+              <w:t xml:space="preserve">1 Nyawa:</w:t>
+            </w:r>
+            <w:r>
+              <w:rPr>
+                <w:color w:val="000000"/>
+                <w:sz w:val="24"/>
+                <w:szCs w:val="24"/>
+                <w:rtl w:val="false"/>
+              </w:rPr>
+              <w:t xml:space="preserve"> Format sistem gugur tunggal tradisional.</w:t>
             </w:r>
             <w:r>
               <w:rPr>
@@ -802,16 +842,36 @@
                 <w:szCs w:val="24"/>
                 <w:rtl w:val="false"/>
               </w:rPr>
-              <w:t xml:space="preserve">Bagan (Gugur):</w:t>
-            </w:r>
-            <w:r>
-              <w:rPr>
-                <w:color w:val="000000"/>
-                <w:sz w:val="24"/>
-                <w:szCs w:val="24"/>
-                <w:rtl w:val="false"/>
-              </w:rPr>
-              <w:t xml:space="preserve"> Pertandingan final standar dengan sistem eliminasi langsung.</w:t>
+              <w:t xml:space="preserve">2 Nyawa (Beda):</w:t>
+            </w:r>
+            <w:r>
+              <w:rPr>
+                <w:color w:val="000000"/>
+                <w:sz w:val="24"/>
+                <w:szCs w:val="24"/>
+                <w:rtl w:val="false"/>
+              </w:rPr>
+              <w:t xml:space="preserve"> Setiap peserta mendapatkan 2 kesempatan bertanding. Bagan akan dikalikan 2 (Bagan AB &amp; CD). Lawan di babak pertama Bagan CD diacak ulang secara otomatis untuk memastikan </w:t>
+            </w:r>
+            <w:r>
+              <w:rPr>
+                <w:b/>
+                <w:bCs/>
+                <w:color w:val="000000"/>
+                <w:sz w:val="24"/>
+                <w:szCs w:val="24"/>
+                <w:rtl w:val="false"/>
+              </w:rPr>
+              <w:t xml:space="preserve">tidak bertemu dengan lawan yang sama seperti di bagan AB</w:t>
+            </w:r>
+            <w:r>
+              <w:rPr>
+                <w:color w:val="000000"/>
+                <w:sz w:val="24"/>
+                <w:szCs w:val="24"/>
+                <w:rtl w:val="false"/>
+              </w:rPr>
+              <w:t xml:space="preserve">.</w:t>
             </w:r>
             <w:r>
               <w:rPr>
@@ -849,7 +909,7 @@
                 <w:szCs w:val="24"/>
                 <w:rtl w:val="false"/>
               </w:rPr>
-              <w:t xml:space="preserve">Poin Penyisihan (R1)</w:t>
+              <w:t xml:space="preserve">Format Bagan Final</w:t>
             </w:r>
           </w:p>
         </w:tc>
@@ -885,16 +945,16 @@
                 <w:szCs w:val="24"/>
                 <w:rtl w:val="false"/>
               </w:rPr>
-              <w:t xml:space="preserve">Normal (1 Nyawa):</w:t>
-            </w:r>
-            <w:r>
-              <w:rPr>
-                <w:color w:val="000000"/>
-                <w:sz w:val="24"/>
-                <w:szCs w:val="24"/>
-                <w:rtl w:val="false"/>
-              </w:rPr>
-              <w:t xml:space="preserve"> Klik sekali langsung lolos ke babak berikutnya.</w:t>
+              <w:t xml:space="preserve">Liga (Round Robin):</w:t>
+            </w:r>
+            <w:r>
+              <w:rPr>
+                <w:color w:val="000000"/>
+                <w:sz w:val="24"/>
+                <w:szCs w:val="24"/>
+                <w:rtl w:val="false"/>
+              </w:rPr>
+              <w:t xml:space="preserve"> 3 juara dari masing-masing pool akan dipertemukan dalam format liga segitiga untuk saling bertanding menentukan Juara 1, 2, dan 3 berdasarkan poin tertinggi.</w:t>
             </w:r>
             <w:r>
               <w:rPr>
@@ -923,36 +983,16 @@
                 <w:szCs w:val="24"/>
                 <w:rtl w:val="false"/>
               </w:rPr>
-              <w:t xml:space="preserve">Duluan 2 Poin:</w:t>
-            </w:r>
-            <w:r>
-              <w:rPr>
-                <w:color w:val="000000"/>
-                <w:sz w:val="24"/>
-                <w:szCs w:val="24"/>
-                <w:rtl w:val="false"/>
-              </w:rPr>
-              <w:t xml:space="preserve"> Berlaku khusus babak penyisihan (Ronde 1). Setiap game mencatat poin. Peserta pertama yang meraih </w:t>
-            </w:r>
-            <w:r>
-              <w:rPr>
-                <w:b/>
-                <w:bCs/>
-                <w:color w:val="000000"/>
-                <w:sz w:val="24"/>
-                <w:szCs w:val="24"/>
-                <w:rtl w:val="false"/>
-              </w:rPr>
-              <w:t xml:space="preserve">2 Poin</w:t>
-            </w:r>
-            <w:r>
-              <w:rPr>
-                <w:color w:val="000000"/>
-                <w:sz w:val="24"/>
-                <w:szCs w:val="24"/>
-                <w:rtl w:val="false"/>
-              </w:rPr>
-              <w:t xml:space="preserve"> adalah pemenang pertandingan.</w:t>
+              <w:t xml:space="preserve">Bagan (Gugur):</w:t>
+            </w:r>
+            <w:r>
+              <w:rPr>
+                <w:color w:val="000000"/>
+                <w:sz w:val="24"/>
+                <w:szCs w:val="24"/>
+                <w:rtl w:val="false"/>
+              </w:rPr>
+              <w:t xml:space="preserve"> Pertandingan final standar dengan sistem eliminasi langsung.</w:t>
             </w:r>
             <w:r>
               <w:rPr>
@@ -990,7 +1030,7 @@
                 <w:szCs w:val="24"/>
                 <w:rtl w:val="false"/>
               </w:rPr>
-              <w:t xml:space="preserve">Input Nama Peserta</w:t>
+              <w:t xml:space="preserve">Poin Penyisihan (R1)</w:t>
             </w:r>
           </w:p>
         </w:tc>
@@ -1006,25 +1046,16 @@
                 <w:szCs w:val="24"/>
                 <w:rtl w:val="false"/>
               </w:rPr>
-              <w:t xml:space="preserve">Masukkan nama peserta (satu nama per baris). </w:t>
-            </w:r>
-            <w:r>
-              <w:rPr>
-                <w:color w:val="000000"/>
-                <w:sz w:val="24"/>
-                <w:szCs w:val="24"/>
-                <w:rtl w:val="false"/>
-              </w:rPr>
-              <w:t xml:space="preserve">&lt;br&gt;</w:t>
-            </w:r>
-            <w:r>
-              <w:rPr>
-                <w:color w:val="000000"/>
-                <w:sz w:val="24"/>
-                <w:szCs w:val="24"/>
-                <w:rtl w:val="false"/>
-              </w:rPr>
-              <w:t xml:space="preserve">💡 </w:t>
+              <w:t xml:space="preserve">&lt;ul&gt;</w:t>
+            </w:r>
+            <w:r>
+              <w:rPr>
+                <w:color w:val="000000"/>
+                <w:sz w:val="24"/>
+                <w:szCs w:val="24"/>
+                <w:rtl w:val="false"/>
+              </w:rPr>
+              <w:t xml:space="preserve">&lt;li&gt;</w:t>
             </w:r>
             <w:r>
               <w:rPr>
@@ -1035,16 +1066,128 @@
                 <w:szCs w:val="24"/>
                 <w:rtl w:val="false"/>
               </w:rPr>
-              <w:t xml:space="preserve">TIPS SEEDING TIM:</w:t>
-            </w:r>
-            <w:r>
-              <w:rPr>
-                <w:color w:val="000000"/>
-                <w:sz w:val="24"/>
-                <w:szCs w:val="24"/>
-                <w:rtl w:val="false"/>
-              </w:rPr>
-              <w:t xml:space="preserve"> Gunakan format </w:t>
+              <w:t xml:space="preserve">Normal (1 Nyawa):</w:t>
+            </w:r>
+            <w:r>
+              <w:rPr>
+                <w:color w:val="000000"/>
+                <w:sz w:val="24"/>
+                <w:szCs w:val="24"/>
+                <w:rtl w:val="false"/>
+              </w:rPr>
+              <w:t xml:space="preserve"> Klik sekali langsung lolos ke babak berikutnya.</w:t>
+            </w:r>
+            <w:r>
+              <w:rPr>
+                <w:color w:val="000000"/>
+                <w:sz w:val="24"/>
+                <w:szCs w:val="24"/>
+                <w:rtl w:val="false"/>
+              </w:rPr>
+              <w:t xml:space="preserve">&lt;/li&gt;</w:t>
+            </w:r>
+            <w:r>
+              <w:rPr>
+                <w:color w:val="000000"/>
+                <w:sz w:val="24"/>
+                <w:szCs w:val="24"/>
+                <w:rtl w:val="false"/>
+              </w:rPr>
+              <w:t xml:space="preserve">&lt;li&gt;</w:t>
+            </w:r>
+            <w:r>
+              <w:rPr>
+                <w:b/>
+                <w:bCs/>
+                <w:color w:val="000000"/>
+                <w:sz w:val="24"/>
+                <w:szCs w:val="24"/>
+                <w:rtl w:val="false"/>
+              </w:rPr>
+              <w:t xml:space="preserve">Duluan 2 Poin:</w:t>
+            </w:r>
+            <w:r>
+              <w:rPr>
+                <w:color w:val="000000"/>
+                <w:sz w:val="24"/>
+                <w:szCs w:val="24"/>
+                <w:rtl w:val="false"/>
+              </w:rPr>
+              <w:t xml:space="preserve"> Berlaku khusus babak penyisihan (Ronde 1). Setiap game mencatat poin. Peserta pertama yang meraih </w:t>
+            </w:r>
+            <w:r>
+              <w:rPr>
+                <w:b/>
+                <w:bCs/>
+                <w:color w:val="000000"/>
+                <w:sz w:val="24"/>
+                <w:szCs w:val="24"/>
+                <w:rtl w:val="false"/>
+              </w:rPr>
+              <w:t xml:space="preserve">2 Poin</w:t>
+            </w:r>
+            <w:r>
+              <w:rPr>
+                <w:color w:val="000000"/>
+                <w:sz w:val="24"/>
+                <w:szCs w:val="24"/>
+                <w:rtl w:val="false"/>
+              </w:rPr>
+              <w:t xml:space="preserve"> adalah pemenang pertandingan.</w:t>
+            </w:r>
+            <w:r>
+              <w:rPr>
+                <w:color w:val="000000"/>
+                <w:sz w:val="24"/>
+                <w:szCs w:val="24"/>
+                <w:rtl w:val="false"/>
+              </w:rPr>
+              <w:t xml:space="preserve">&lt;/li&gt;</w:t>
+            </w:r>
+            <w:r>
+              <w:rPr>
+                <w:color w:val="000000"/>
+                <w:sz w:val="24"/>
+                <w:szCs w:val="24"/>
+                <w:rtl w:val="false"/>
+              </w:rPr>
+              <w:t xml:space="preserve">&lt;/ul&gt;</w:t>
+            </w:r>
+          </w:p>
+        </w:tc>
+      </w:tr>
+      <w:tr>
+        <w:tc>
+          <w:p>
+            <w:pPr>
+              <w:jc w:val="left"/>
+            </w:pPr>
+            <w:r>
+              <w:rPr>
+                <w:b/>
+                <w:bCs/>
+                <w:color w:val="000000"/>
+                <w:sz w:val="24"/>
+                <w:szCs w:val="24"/>
+                <w:rtl w:val="false"/>
+              </w:rPr>
+              <w:t xml:space="preserve">Input Nama Peserta</w:t>
+            </w:r>
+          </w:p>
+        </w:tc>
+        <w:tc>
+          <w:p>
+            <w:pPr>
+              <w:jc w:val="left"/>
+            </w:pPr>
+            <w:r>
+              <w:rPr>
+                <w:color w:val="000000"/>
+                <w:sz w:val="24"/>
+                <w:szCs w:val="24"/>
+                <w:rtl w:val="false"/>
+              </w:rPr>
+              <w:t xml:space="preserve">Masukkan nama peserta (satu nama per baris). Sesuaikan kurung siku </w:t>
             </w:r>
             <w:r>
               <w:rPr>
@@ -1055,36 +1198,16 @@
                 <w:shd w:fill="F5F5F5"/>
                 <w:rtl w:val="false"/>
               </w:rPr>
-              <w:t xml:space="preserve">[Nama Tim] Nama Peserta</w:t>
-            </w:r>
-            <w:r>
-              <w:rPr>
-                <w:color w:val="000000"/>
-                <w:sz w:val="24"/>
-                <w:szCs w:val="24"/>
-                <w:rtl w:val="false"/>
-              </w:rPr>
-              <w:t xml:space="preserve"> (contoh: </w:t>
-            </w:r>
-            <w:r>
-              <w:rPr>
-                <w:rFonts w:ascii="Courier New" w:cs="Courier New" w:eastAsia="Courier New" w:hAnsi="Courier New"/>
-                <w:color w:val="444444"/>
-                <w:sz w:val="20"/>
-                <w:szCs w:val="20"/>
-                <w:shd w:fill="F5F5F5"/>
-                <w:rtl w:val="false"/>
-              </w:rPr>
-              <w:t xml:space="preserve">[Senyap] Daim</w:t>
-            </w:r>
-            <w:r>
-              <w:rPr>
-                <w:color w:val="000000"/>
-                <w:sz w:val="24"/>
-                <w:szCs w:val="24"/>
-                <w:rtl w:val="false"/>
-              </w:rPr>
-              <w:t xml:space="preserve">). Sistem secara otomatis akan menyebarkan peserta dengan nama tim yang sama ke pool atau kuarter yang berbeda agar mereka </w:t>
+              <w:t xml:space="preserve">[...]</w:t>
+            </w:r>
+            <w:r>
+              <w:rPr>
+                <w:color w:val="000000"/>
+                <w:sz w:val="24"/>
+                <w:szCs w:val="24"/>
+                <w:rtl w:val="false"/>
+              </w:rPr>
+              <w:t xml:space="preserve"> di depan nama dengan </w:t>
             </w:r>
             <w:r>
               <w:rPr>
@@ -1095,16 +1218,16 @@
                 <w:szCs w:val="24"/>
                 <w:rtl w:val="false"/>
               </w:rPr>
-              <w:t xml:space="preserve">tidak saling berhadapan di babak-babak awal</w:t>
-            </w:r>
-            <w:r>
-              <w:rPr>
-                <w:color w:val="000000"/>
-                <w:sz w:val="24"/>
-                <w:szCs w:val="24"/>
-                <w:rtl w:val="false"/>
-              </w:rPr>
-              <w:t xml:space="preserve">.</w:t>
+              <w:t xml:space="preserve">Tipe Cakupan Turnamen</w:t>
+            </w:r>
+            <w:r>
+              <w:rPr>
+                <w:color w:val="000000"/>
+                <w:sz w:val="24"/>
+                <w:szCs w:val="24"/>
+                <w:rtl w:val="false"/>
+              </w:rPr>
+              <w:t xml:space="preserve"> yang Anda pilih agar algoritma anti-bentrok berjalan dengan optimal.</w:t>
             </w:r>
           </w:p>
         </w:tc>
@@ -1117,7 +1240,7 @@
         <w:bidi w:val="false"/>
         <w:spacing w:after="120" w:before="240"/>
       </w:pPr>
-      <w:bookmarkStart w:name="_Toc__3_Manajemen_Pertandingan_Live_Match_Con_1779105570543" w:id="1"/>
+      <w:bookmarkStart w:name="_Toc__3_Manajemen_Pertandingan_Live_Match_Con_1779166323406" w:id="1"/>
       <w:r>
         <w:rPr>
           <w:b w:val="false"/>
@@ -1157,7 +1280,7 @@
         <w:bidi w:val="false"/>
         <w:spacing w:after="120" w:before="240"/>
       </w:pPr>
-      <w:bookmarkStart w:name="_Toc_A_Tombol_Kontrol_Pertandingan_Hanya_Wasi_1779105570543" w:id="1"/>
+      <w:bookmarkStart w:name="_Toc_A_Tombol_Kontrol_Pertandingan_Hanya_Wasi_1779166323406" w:id="1"/>
       <w:r>
         <w:rPr>
           <w:b w:val="false"/>
@@ -1345,7 +1468,7 @@
         <w:bidi w:val="false"/>
         <w:spacing w:after="120" w:before="240"/>
       </w:pPr>
-      <w:bookmarkStart w:name="_Toc_B_Fitur_Pencarian_Cepat_Search_1779105570543" w:id="1"/>
+      <w:bookmarkStart w:name="_Toc_B_Fitur_Pencarian_Cepat_Search_1779166323406" w:id="1"/>
       <w:r>
         <w:rPr>
           <w:b w:val="false"/>
@@ -1449,7 +1572,7 @@
         <w:bidi w:val="false"/>
         <w:spacing w:after="120" w:before="240"/>
       </w:pPr>
-      <w:bookmarkStart w:name="_Toc__4_Pencatatan_Pemenang_Skor_1779105570543" w:id="1"/>
+      <w:bookmarkStart w:name="_Toc__4_Pencatatan_Pemenang_Skor_1779166323407" w:id="1"/>
       <w:r>
         <w:rPr>
           <w:b w:val="false"/>
@@ -1489,7 +1612,7 @@
         <w:bidi w:val="false"/>
         <w:spacing w:after="120" w:before="240"/>
       </w:pPr>
-      <w:bookmarkStart w:name="_Toc_A_Jika_Mode_Normal_1_Nyawa_Aktif_1779105570543" w:id="1"/>
+      <w:bookmarkStart w:name="_Toc_A_Jika_Mode_Normal_1_Nyawa_Aktif_1779166323407" w:id="1"/>
       <w:r>
         <w:rPr>
           <w:b w:val="false"/>
@@ -1624,7 +1747,7 @@
         <w:bidi w:val="false"/>
         <w:spacing w:after="120" w:before="240"/>
       </w:pPr>
-      <w:bookmarkStart w:name="_Toc_B_Jika_Mode_Duluan_2_Poin_Aktif_Khusus_R_1779105570544" w:id="1"/>
+      <w:bookmarkStart w:name="_Toc_B_Jika_Mode_Duluan_2_Poin_Aktif_Khusus_R_1779166323407" w:id="1"/>
       <w:r>
         <w:rPr>
           <w:b w:val="false"/>
@@ -1934,7 +2057,7 @@
         <w:bidi w:val="false"/>
         <w:spacing w:after="120" w:before="240"/>
       </w:pPr>
-      <w:bookmarkStart w:name="_Toc__5_Fitur_Khusus_Koreksi_Darurat_1779105570544" w:id="1"/>
+      <w:bookmarkStart w:name="_Toc__5_Fitur_Khusus_Koreksi_Darurat_1779166323408" w:id="1"/>
       <w:r>
         <w:rPr>
           <w:b w:val="false"/>
@@ -2142,7 +2265,7 @@
         <w:bidi w:val="false"/>
         <w:spacing w:after="120" w:before="240"/>
       </w:pPr>
-      <w:bookmarkStart w:name="_Toc__6_Pengarsipan_Riwayat_Turnamen_1779105570544" w:id="1"/>
+      <w:bookmarkStart w:name="_Toc__6_Pengarsipan_Riwayat_Turnamen_1779166323408" w:id="1"/>
       <w:r>
         <w:rPr>
           <w:b w:val="false"/>

</xml_diff>